<commit_message>
Regenerate PROJECTS_SUMMARY.docx from updated markdown
Rebuild the Word summary to match PROJECTS_SUMMARY.md after retiring
cyber-proposals and cyber-eac-tool (22 projects, was 24). Bump the
generated date to 2026-07-11 in both files.

Co-Authored-By: Claude Opus 4.8 <noreply@anthropic.com>
</commit_message>
<xml_diff>
--- a/PROJECTS_SUMMARY.docx
+++ b/PROJECTS_SUMMARY.docx
@@ -5,7 +5,6 @@
     <w:p>
       <w:pPr>
         <w:pStyle w:val="Heading1"/>
-        <w:jc w:val="left"/>
       </w:pPr>
       <w:r>
         <w:t xml:space="preserve">Dev Folder Project Summary</w:t>
@@ -13,19 +12,16 @@
     </w:p>
     <w:p>
       <w:pPr>
-        <w:spacing w:after="240"/>
-      </w:pPr>
-      <w:r>
-        <w:rPr>
-          <w:i/>
-          <w:iCs/>
-        </w:rPr>
-        <w:t xml:space="preserve">A summary of all projects under /Users/ogreen/Documents/dev/, generated 2026-05-25.</w:t>
-      </w:r>
-    </w:p>
-    <w:p>
-      <w:pPr>
-        <w:pStyle w:val="Heading2"/>
+        <w:spacing w:after="40"/>
+      </w:pPr>
+      <w:r>
+        <w:t xml:space="preserve">A summary of all projects under /Users/ogreen/Documents/dev/, generated 2026-07-11.</w:t>
+      </w:r>
+    </w:p>
+    <w:p>
+      <w:pPr>
+        <w:pStyle w:val="Heading2"/>
+        <w:spacing w:after="60" w:before="220"/>
       </w:pPr>
       <w:r>
         <w:t xml:space="preserve">PRTG Import</w:t>
@@ -33,7 +29,7 @@
     </w:p>
     <w:p>
       <w:pPr>
-        <w:spacing w:after="80"/>
+        <w:spacing w:after="40"/>
       </w:pPr>
       <w:r>
         <w:rPr>
@@ -48,7 +44,7 @@
     </w:p>
     <w:p>
       <w:pPr>
-        <w:spacing w:after="80"/>
+        <w:spacing w:after="40"/>
       </w:pPr>
       <w:r>
         <w:rPr>
@@ -63,7 +59,7 @@
     </w:p>
     <w:p>
       <w:pPr>
-        <w:spacing w:after="80"/>
+        <w:spacing w:after="40"/>
       </w:pPr>
       <w:r>
         <w:rPr>
@@ -79,6 +75,7 @@
     <w:p>
       <w:pPr>
         <w:pStyle w:val="Heading2"/>
+        <w:spacing w:after="60" w:before="220"/>
       </w:pPr>
       <w:r>
         <w:t xml:space="preserve">Pocket Probe</w:t>
@@ -86,7 +83,7 @@
     </w:p>
     <w:p>
       <w:pPr>
-        <w:spacing w:after="80"/>
+        <w:spacing w:after="40"/>
       </w:pPr>
       <w:r>
         <w:rPr>
@@ -101,7 +98,7 @@
     </w:p>
     <w:p>
       <w:pPr>
-        <w:spacing w:after="80"/>
+        <w:spacing w:after="40"/>
       </w:pPr>
       <w:r>
         <w:rPr>
@@ -116,7 +113,7 @@
     </w:p>
     <w:p>
       <w:pPr>
-        <w:spacing w:after="80"/>
+        <w:spacing w:after="40"/>
       </w:pPr>
       <w:r>
         <w:rPr>
@@ -132,6 +129,7 @@
     <w:p>
       <w:pPr>
         <w:pStyle w:val="Heading2"/>
+        <w:spacing w:after="60" w:before="220"/>
       </w:pPr>
       <w:r>
         <w:t xml:space="preserve">account-store</w:t>
@@ -139,7 +137,7 @@
     </w:p>
     <w:p>
       <w:pPr>
-        <w:spacing w:after="80"/>
+        <w:spacing w:after="40"/>
       </w:pPr>
       <w:r>
         <w:rPr>
@@ -154,7 +152,7 @@
     </w:p>
     <w:p>
       <w:pPr>
-        <w:spacing w:after="80"/>
+        <w:spacing w:after="40"/>
       </w:pPr>
       <w:r>
         <w:rPr>
@@ -169,7 +167,7 @@
     </w:p>
     <w:p>
       <w:pPr>
-        <w:spacing w:after="80"/>
+        <w:spacing w:after="40"/>
       </w:pPr>
       <w:r>
         <w:rPr>
@@ -185,6 +183,7 @@
     <w:p>
       <w:pPr>
         <w:pStyle w:val="Heading2"/>
+        <w:spacing w:after="60" w:before="220"/>
       </w:pPr>
       <w:r>
         <w:t xml:space="preserve">cert-manager</w:t>
@@ -192,7 +191,7 @@
     </w:p>
     <w:p>
       <w:pPr>
-        <w:spacing w:after="80"/>
+        <w:spacing w:after="40"/>
       </w:pPr>
       <w:r>
         <w:rPr>
@@ -207,7 +206,7 @@
     </w:p>
     <w:p>
       <w:pPr>
-        <w:spacing w:after="80"/>
+        <w:spacing w:after="40"/>
       </w:pPr>
       <w:r>
         <w:rPr>
@@ -222,7 +221,7 @@
     </w:p>
     <w:p>
       <w:pPr>
-        <w:spacing w:after="80"/>
+        <w:spacing w:after="40"/>
       </w:pPr>
       <w:r>
         <w:rPr>
@@ -238,6 +237,7 @@
     <w:p>
       <w:pPr>
         <w:pStyle w:val="Heading2"/>
+        <w:spacing w:after="60" w:before="220"/>
       </w:pPr>
       <w:r>
         <w:t xml:space="preserve">claude-sync</w:t>
@@ -245,7 +245,7 @@
     </w:p>
     <w:p>
       <w:pPr>
-        <w:spacing w:after="80"/>
+        <w:spacing w:after="40"/>
       </w:pPr>
       <w:r>
         <w:rPr>
@@ -260,7 +260,7 @@
     </w:p>
     <w:p>
       <w:pPr>
-        <w:spacing w:after="80"/>
+        <w:spacing w:after="40"/>
       </w:pPr>
       <w:r>
         <w:rPr>
@@ -275,7 +275,7 @@
     </w:p>
     <w:p>
       <w:pPr>
-        <w:spacing w:after="80"/>
+        <w:spacing w:after="40"/>
       </w:pPr>
       <w:r>
         <w:rPr>
@@ -291,6 +291,7 @@
     <w:p>
       <w:pPr>
         <w:pStyle w:val="Heading2"/>
+        <w:spacing w:after="60" w:before="220"/>
       </w:pPr>
       <w:r>
         <w:t xml:space="preserve">cyber-artifact-gen</w:t>
@@ -298,7 +299,7 @@
     </w:p>
     <w:p>
       <w:pPr>
-        <w:spacing w:after="80"/>
+        <w:spacing w:after="40"/>
       </w:pPr>
       <w:r>
         <w:rPr>
@@ -313,7 +314,7 @@
     </w:p>
     <w:p>
       <w:pPr>
-        <w:spacing w:after="80"/>
+        <w:spacing w:after="40"/>
       </w:pPr>
       <w:r>
         <w:rPr>
@@ -328,7 +329,7 @@
     </w:p>
     <w:p>
       <w:pPr>
-        <w:spacing w:after="80"/>
+        <w:spacing w:after="40"/>
       </w:pPr>
       <w:r>
         <w:rPr>
@@ -344,59 +345,7 @@
     <w:p>
       <w:pPr>
         <w:pStyle w:val="Heading2"/>
-      </w:pPr>
-      <w:r>
-        <w:t xml:space="preserve">cyber-eac-tool</w:t>
-      </w:r>
-    </w:p>
-    <w:p>
-      <w:pPr>
-        <w:spacing w:after="80"/>
-      </w:pPr>
-      <w:r>
-        <w:rPr>
-          <w:b/>
-          <w:bCs/>
-        </w:rPr>
-        <w:t xml:space="preserve">Purpose: </w:t>
-      </w:r>
-      <w:r>
-        <w:t xml:space="preserve">Browser-based calculator for earned-value forecasting on DoD cyber projects. Derives EAC, ETC, CPI, SPI, and risk-adjusted forecasts with Excel export.</w:t>
-      </w:r>
-    </w:p>
-    <w:p>
-      <w:pPr>
-        <w:spacing w:after="80"/>
-      </w:pPr>
-      <w:r>
-        <w:rPr>
-          <w:b/>
-          <w:bCs/>
-        </w:rPr>
-        <w:t xml:space="preserve">Stack: </w:t>
-      </w:r>
-      <w:r>
-        <w:t xml:space="preserve">JavaScript (frontend), Python (serve.py), openpyxl.</w:t>
-      </w:r>
-    </w:p>
-    <w:p>
-      <w:pPr>
-        <w:spacing w:after="80"/>
-      </w:pPr>
-      <w:r>
-        <w:rPr>
-          <w:b/>
-          <w:bCs/>
-        </w:rPr>
-        <w:t xml:space="preserve">Notes: </w:t>
-      </w:r>
-      <w:r>
-        <w:t xml:space="preserve">Standalone tool serving on localhost:8010; Sage Contractor integration for actuals import.</w:t>
-      </w:r>
-    </w:p>
-    <w:p>
-      <w:pPr>
-        <w:pStyle w:val="Heading2"/>
+        <w:spacing w:after="60" w:before="220"/>
       </w:pPr>
       <w:r>
         <w:t xml:space="preserve">cyber-estimates</w:t>
@@ -404,7 +353,7 @@
     </w:p>
     <w:p>
       <w:pPr>
-        <w:spacing w:after="80"/>
+        <w:spacing w:after="40"/>
       </w:pPr>
       <w:r>
         <w:rPr>
@@ -419,7 +368,7 @@
     </w:p>
     <w:p>
       <w:pPr>
-        <w:spacing w:after="80"/>
+        <w:spacing w:after="40"/>
       </w:pPr>
       <w:r>
         <w:rPr>
@@ -434,75 +383,23 @@
     </w:p>
     <w:p>
       <w:pPr>
-        <w:spacing w:after="80"/>
-      </w:pPr>
-      <w:r>
-        <w:rPr>
-          <w:b/>
-          <w:bCs/>
-        </w:rPr>
-        <w:t xml:space="preserve">Notes: </w:t>
-      </w:r>
-      <w:r>
-        <w:t xml:space="preserve">Working directory for proposal generation; references the cyber-proposals skill.</w:t>
-      </w:r>
-    </w:p>
-    <w:p>
-      <w:pPr>
-        <w:pStyle w:val="Heading2"/>
-      </w:pPr>
-      <w:r>
-        <w:t xml:space="preserve">cyber-proposals</w:t>
-      </w:r>
-    </w:p>
-    <w:p>
-      <w:pPr>
-        <w:spacing w:after="80"/>
-      </w:pPr>
-      <w:r>
-        <w:rPr>
-          <w:b/>
-          <w:bCs/>
-        </w:rPr>
-        <w:t xml:space="preserve">Purpose: </w:t>
-      </w:r>
-      <w:r>
-        <w:t xml:space="preserve">Reusable DoD MILCON cybersecurity proposal toolkit for two USACE MATOCs (MRR + UMCS). Shared engine for pricing + scope extraction + tech proposal generation.</w:t>
-      </w:r>
-    </w:p>
-    <w:p>
-      <w:pPr>
-        <w:spacing w:after="80"/>
-      </w:pPr>
-      <w:r>
-        <w:rPr>
-          <w:b/>
-          <w:bCs/>
-        </w:rPr>
-        <w:t xml:space="preserve">Stack: </w:t>
-      </w:r>
-      <w:r>
-        <w:t xml:space="preserve">Python (Claude API, openpyxl), Node.js (docx), structured scope JSON, AI-driven extraction.</w:t>
-      </w:r>
-    </w:p>
-    <w:p>
-      <w:pPr>
-        <w:spacing w:after="80"/>
-      </w:pPr>
-      <w:r>
-        <w:rPr>
-          <w:b/>
-          <w:bCs/>
-        </w:rPr>
-        <w:t xml:space="preserve">Notes: </w:t>
-      </w:r>
-      <w:r>
-        <w:t xml:space="preserve">Multi-MATOC organization with per-MATOC pricing defaults and role codes; prompt caching enabled.</w:t>
-      </w:r>
-    </w:p>
-    <w:p>
-      <w:pPr>
-        <w:pStyle w:val="Heading2"/>
+        <w:spacing w:after="40"/>
+      </w:pPr>
+      <w:r>
+        <w:rPr>
+          <w:b/>
+          <w:bCs/>
+        </w:rPr>
+        <w:t xml:space="preserve">Notes: </w:t>
+      </w:r>
+      <w:r>
+        <w:t xml:space="preserve">Standalone working directory for proposal generation; carries the portable navfac-cyber-proposal skill bundle.</w:t>
+      </w:r>
+    </w:p>
+    <w:p>
+      <w:pPr>
+        <w:pStyle w:val="Heading2"/>
+        <w:spacing w:after="60" w:before="220"/>
       </w:pPr>
       <w:r>
         <w:t xml:space="preserve">digital-twin</w:t>
@@ -510,7 +407,7 @@
     </w:p>
     <w:p>
       <w:pPr>
-        <w:spacing w:after="80"/>
+        <w:spacing w:after="40"/>
       </w:pPr>
       <w:r>
         <w:rPr>
@@ -525,7 +422,7 @@
     </w:p>
     <w:p>
       <w:pPr>
-        <w:spacing w:after="80"/>
+        <w:spacing w:after="40"/>
       </w:pPr>
       <w:r>
         <w:rPr>
@@ -540,7 +437,7 @@
     </w:p>
     <w:p>
       <w:pPr>
-        <w:spacing w:after="80"/>
+        <w:spacing w:after="40"/>
       </w:pPr>
       <w:r>
         <w:rPr>
@@ -556,6 +453,7 @@
     <w:p>
       <w:pPr>
         <w:pStyle w:val="Heading2"/>
+        <w:spacing w:after="60" w:before="220"/>
       </w:pPr>
       <w:r>
         <w:t xml:space="preserve">email-monitor</w:t>
@@ -563,7 +461,7 @@
     </w:p>
     <w:p>
       <w:pPr>
-        <w:spacing w:after="80"/>
+        <w:spacing w:after="40"/>
       </w:pPr>
       <w:r>
         <w:rPr>
@@ -578,7 +476,7 @@
     </w:p>
     <w:p>
       <w:pPr>
-        <w:spacing w:after="80"/>
+        <w:spacing w:after="40"/>
       </w:pPr>
       <w:r>
         <w:rPr>
@@ -593,7 +491,7 @@
     </w:p>
     <w:p>
       <w:pPr>
-        <w:spacing w:after="80"/>
+        <w:spacing w:after="40"/>
       </w:pPr>
       <w:r>
         <w:rPr>
@@ -609,6 +507,7 @@
     <w:p>
       <w:pPr>
         <w:pStyle w:val="Heading2"/>
+        <w:spacing w:after="60" w:before="220"/>
       </w:pPr>
       <w:r>
         <w:t xml:space="preserve">email-processor</w:t>
@@ -616,7 +515,7 @@
     </w:p>
     <w:p>
       <w:pPr>
-        <w:spacing w:after="80"/>
+        <w:spacing w:after="40"/>
       </w:pPr>
       <w:r>
         <w:rPr>
@@ -631,7 +530,7 @@
     </w:p>
     <w:p>
       <w:pPr>
-        <w:spacing w:after="80"/>
+        <w:spacing w:after="40"/>
       </w:pPr>
       <w:r>
         <w:rPr>
@@ -646,7 +545,7 @@
     </w:p>
     <w:p>
       <w:pPr>
-        <w:spacing w:after="80"/>
+        <w:spacing w:after="40"/>
       </w:pPr>
       <w:r>
         <w:rPr>
@@ -662,6 +561,7 @@
     <w:p>
       <w:pPr>
         <w:pStyle w:val="Heading2"/>
+        <w:spacing w:after="60" w:before="220"/>
       </w:pPr>
       <w:r>
         <w:t xml:space="preserve">ethernet-link-analyzer</w:t>
@@ -669,7 +569,7 @@
     </w:p>
     <w:p>
       <w:pPr>
-        <w:spacing w:after="80"/>
+        <w:spacing w:after="40"/>
       </w:pPr>
       <w:r>
         <w:rPr>
@@ -684,7 +584,7 @@
     </w:p>
     <w:p>
       <w:pPr>
-        <w:spacing w:after="80"/>
+        <w:spacing w:after="40"/>
       </w:pPr>
       <w:r>
         <w:rPr>
@@ -699,7 +599,7 @@
     </w:p>
     <w:p>
       <w:pPr>
-        <w:spacing w:after="80"/>
+        <w:spacing w:after="40"/>
       </w:pPr>
       <w:r>
         <w:rPr>
@@ -715,6 +615,7 @@
     <w:p>
       <w:pPr>
         <w:pStyle w:val="Heading2"/>
+        <w:spacing w:after="60" w:before="220"/>
       </w:pPr>
       <w:r>
         <w:t xml:space="preserve">floor-plan-editor</w:t>
@@ -722,7 +623,7 @@
     </w:p>
     <w:p>
       <w:pPr>
-        <w:spacing w:after="80"/>
+        <w:spacing w:after="40"/>
       </w:pPr>
       <w:r>
         <w:rPr>
@@ -737,7 +638,7 @@
     </w:p>
     <w:p>
       <w:pPr>
-        <w:spacing w:after="80"/>
+        <w:spacing w:after="40"/>
       </w:pPr>
       <w:r>
         <w:rPr>
@@ -752,7 +653,7 @@
     </w:p>
     <w:p>
       <w:pPr>
-        <w:spacing w:after="80"/>
+        <w:spacing w:after="40"/>
       </w:pPr>
       <w:r>
         <w:rPr>
@@ -768,6 +669,7 @@
     <w:p>
       <w:pPr>
         <w:pStyle w:val="Heading2"/>
+        <w:spacing w:after="60" w:before="220"/>
       </w:pPr>
       <w:r>
         <w:t xml:space="preserve">kml</w:t>
@@ -775,7 +677,7 @@
     </w:p>
     <w:p>
       <w:pPr>
-        <w:spacing w:after="80"/>
+        <w:spacing w:after="40"/>
       </w:pPr>
       <w:r>
         <w:rPr>
@@ -790,7 +692,7 @@
     </w:p>
     <w:p>
       <w:pPr>
-        <w:spacing w:after="80"/>
+        <w:spacing w:after="40"/>
       </w:pPr>
       <w:r>
         <w:rPr>
@@ -805,7 +707,7 @@
     </w:p>
     <w:p>
       <w:pPr>
-        <w:spacing w:after="80"/>
+        <w:spacing w:after="40"/>
       </w:pPr>
       <w:r>
         <w:rPr>
@@ -821,6 +723,7 @@
     <w:p>
       <w:pPr>
         <w:pStyle w:val="Heading2"/>
+        <w:spacing w:after="60" w:before="220"/>
       </w:pPr>
       <w:r>
         <w:t xml:space="preserve">network-scanner</w:t>
@@ -828,7 +731,7 @@
     </w:p>
     <w:p>
       <w:pPr>
-        <w:spacing w:after="80"/>
+        <w:spacing w:after="40"/>
       </w:pPr>
       <w:r>
         <w:rPr>
@@ -843,7 +746,7 @@
     </w:p>
     <w:p>
       <w:pPr>
-        <w:spacing w:after="80"/>
+        <w:spacing w:after="40"/>
       </w:pPr>
       <w:r>
         <w:rPr>
@@ -858,7 +761,7 @@
     </w:p>
     <w:p>
       <w:pPr>
-        <w:spacing w:after="80"/>
+        <w:spacing w:after="40"/>
       </w:pPr>
       <w:r>
         <w:rPr>
@@ -874,6 +777,7 @@
     <w:p>
       <w:pPr>
         <w:pStyle w:val="Heading2"/>
+        <w:spacing w:after="60" w:before="220"/>
       </w:pPr>
       <w:r>
         <w:t xml:space="preserve">niagara-docs</w:t>
@@ -881,7 +785,7 @@
     </w:p>
     <w:p>
       <w:pPr>
-        <w:spacing w:after="80"/>
+        <w:spacing w:after="40"/>
       </w:pPr>
       <w:r>
         <w:rPr>
@@ -896,7 +800,7 @@
     </w:p>
     <w:p>
       <w:pPr>
-        <w:spacing w:after="80"/>
+        <w:spacing w:after="40"/>
       </w:pPr>
       <w:r>
         <w:rPr>
@@ -911,7 +815,7 @@
     </w:p>
     <w:p>
       <w:pPr>
-        <w:spacing w:after="80"/>
+        <w:spacing w:after="40"/>
       </w:pPr>
       <w:r>
         <w:rPr>
@@ -927,6 +831,7 @@
     <w:p>
       <w:pPr>
         <w:pStyle w:val="Heading2"/>
+        <w:spacing w:after="60" w:before="220"/>
       </w:pPr>
       <w:r>
         <w:t xml:space="preserve">outlook-followup</w:t>
@@ -934,7 +839,7 @@
     </w:p>
     <w:p>
       <w:pPr>
-        <w:spacing w:after="80"/>
+        <w:spacing w:after="40"/>
       </w:pPr>
       <w:r>
         <w:rPr>
@@ -949,7 +854,7 @@
     </w:p>
     <w:p>
       <w:pPr>
-        <w:spacing w:after="80"/>
+        <w:spacing w:after="40"/>
       </w:pPr>
       <w:r>
         <w:rPr>
@@ -964,7 +869,7 @@
     </w:p>
     <w:p>
       <w:pPr>
-        <w:spacing w:after="80"/>
+        <w:spacing w:after="40"/>
       </w:pPr>
       <w:r>
         <w:rPr>
@@ -980,6 +885,7 @@
     <w:p>
       <w:pPr>
         <w:pStyle w:val="Heading2"/>
+        <w:spacing w:after="60" w:before="220"/>
       </w:pPr>
       <w:r>
         <w:t xml:space="preserve">past-performance</w:t>
@@ -987,7 +893,7 @@
     </w:p>
     <w:p>
       <w:pPr>
-        <w:spacing w:after="80"/>
+        <w:spacing w:after="40"/>
       </w:pPr>
       <w:r>
         <w:rPr>
@@ -1002,7 +908,7 @@
     </w:p>
     <w:p>
       <w:pPr>
-        <w:spacing w:after="80"/>
+        <w:spacing w:after="40"/>
       </w:pPr>
       <w:r>
         <w:rPr>
@@ -1017,7 +923,7 @@
     </w:p>
     <w:p>
       <w:pPr>
-        <w:spacing w:after="80"/>
+        <w:spacing w:after="40"/>
       </w:pPr>
       <w:r>
         <w:rPr>
@@ -1033,6 +939,7 @@
     <w:p>
       <w:pPr>
         <w:pStyle w:val="Heading2"/>
+        <w:spacing w:after="60" w:before="220"/>
       </w:pPr>
       <w:r>
         <w:t xml:space="preserve">project-tracking</w:t>
@@ -1040,7 +947,7 @@
     </w:p>
     <w:p>
       <w:pPr>
-        <w:spacing w:after="80"/>
+        <w:spacing w:after="40"/>
       </w:pPr>
       <w:r>
         <w:rPr>
@@ -1055,7 +962,7 @@
     </w:p>
     <w:p>
       <w:pPr>
-        <w:spacing w:after="80"/>
+        <w:spacing w:after="40"/>
       </w:pPr>
       <w:r>
         <w:rPr>
@@ -1070,7 +977,7 @@
     </w:p>
     <w:p>
       <w:pPr>
-        <w:spacing w:after="80"/>
+        <w:spacing w:after="40"/>
       </w:pPr>
       <w:r>
         <w:rPr>
@@ -1086,6 +993,7 @@
     <w:p>
       <w:pPr>
         <w:pStyle w:val="Heading2"/>
+        <w:spacing w:after="60" w:before="220"/>
       </w:pPr>
       <w:r>
         <w:t xml:space="preserve">rfp-automation</w:t>
@@ -1093,7 +1001,7 @@
     </w:p>
     <w:p>
       <w:pPr>
-        <w:spacing w:after="80"/>
+        <w:spacing w:after="40"/>
       </w:pPr>
       <w:r>
         <w:rPr>
@@ -1108,7 +1016,7 @@
     </w:p>
     <w:p>
       <w:pPr>
-        <w:spacing w:after="80"/>
+        <w:spacing w:after="40"/>
       </w:pPr>
       <w:r>
         <w:rPr>
@@ -1123,22 +1031,23 @@
     </w:p>
     <w:p>
       <w:pPr>
-        <w:spacing w:after="80"/>
-      </w:pPr>
-      <w:r>
-        <w:rPr>
-          <w:b/>
-          <w:bCs/>
-        </w:rPr>
-        <w:t xml:space="preserve">Notes: </w:t>
-      </w:r>
-      <w:r>
-        <w:t xml:space="preserve">Production system with 1800+ tests; dashboard at port 8108; cyber-proposals adapter hooks in.</w:t>
-      </w:r>
-    </w:p>
-    <w:p>
-      <w:pPr>
-        <w:pStyle w:val="Heading2"/>
+        <w:spacing w:after="40"/>
+      </w:pPr>
+      <w:r>
+        <w:rPr>
+          <w:b/>
+          <w:bCs/>
+        </w:rPr>
+        <w:t xml:space="preserve">Notes: </w:t>
+      </w:r>
+      <w:r>
+        <w:t xml:space="preserve">Production system with 1800+ tests; dashboard at port 8108; vendors the MRR/UMCS pricing + tech-proposal engine (formerly the separate cyber-proposals repo).</w:t>
+      </w:r>
+    </w:p>
+    <w:p>
+      <w:pPr>
+        <w:pStyle w:val="Heading2"/>
+        <w:spacing w:after="60" w:before="220"/>
       </w:pPr>
       <w:r>
         <w:t xml:space="preserve">scripts</w:t>
@@ -1146,7 +1055,7 @@
     </w:p>
     <w:p>
       <w:pPr>
-        <w:spacing w:after="80"/>
+        <w:spacing w:after="40"/>
       </w:pPr>
       <w:r>
         <w:rPr>
@@ -1161,7 +1070,7 @@
     </w:p>
     <w:p>
       <w:pPr>
-        <w:spacing w:after="80"/>
+        <w:spacing w:after="40"/>
       </w:pPr>
       <w:r>
         <w:rPr>
@@ -1176,7 +1085,7 @@
     </w:p>
     <w:p>
       <w:pPr>
-        <w:spacing w:after="80"/>
+        <w:spacing w:after="40"/>
       </w:pPr>
       <w:r>
         <w:rPr>
@@ -1192,6 +1101,7 @@
     <w:p>
       <w:pPr>
         <w:pStyle w:val="Heading2"/>
+        <w:spacing w:after="60" w:before="220"/>
       </w:pPr>
       <w:r>
         <w:t xml:space="preserve">ssi-design-system</w:t>
@@ -1199,7 +1109,7 @@
     </w:p>
     <w:p>
       <w:pPr>
-        <w:spacing w:after="80"/>
+        <w:spacing w:after="40"/>
       </w:pPr>
       <w:r>
         <w:rPr>
@@ -1214,7 +1124,7 @@
     </w:p>
     <w:p>
       <w:pPr>
-        <w:spacing w:after="80"/>
+        <w:spacing w:after="40"/>
       </w:pPr>
       <w:r>
         <w:rPr>
@@ -1229,7 +1139,7 @@
     </w:p>
     <w:p>
       <w:pPr>
-        <w:spacing w:after="80"/>
+        <w:spacing w:after="40"/>
       </w:pPr>
       <w:r>
         <w:rPr>
@@ -1245,6 +1155,7 @@
     <w:p>
       <w:pPr>
         <w:pStyle w:val="Heading2"/>
+        <w:spacing w:after="60" w:before="220"/>
       </w:pPr>
       <w:r>
         <w:t xml:space="preserve">virtual-devices</w:t>
@@ -1252,7 +1163,7 @@
     </w:p>
     <w:p>
       <w:pPr>
-        <w:spacing w:after="80"/>
+        <w:spacing w:after="40"/>
       </w:pPr>
       <w:r>
         <w:rPr>
@@ -1267,7 +1178,7 @@
     </w:p>
     <w:p>
       <w:pPr>
-        <w:spacing w:after="80"/>
+        <w:spacing w:after="40"/>
       </w:pPr>
       <w:r>
         <w:rPr>
@@ -1282,7 +1193,7 @@
     </w:p>
     <w:p>
       <w:pPr>
-        <w:spacing w:after="80"/>
+        <w:spacing w:after="40"/>
       </w:pPr>
       <w:r>
         <w:rPr>
@@ -1481,13 +1392,7 @@
 <file path=word/styles.xml><?xml version="1.0" encoding="utf-8"?>
 <w:styles xmlns:mc="http://schemas.openxmlformats.org/markup-compatibility/2006" xmlns:r="http://schemas.openxmlformats.org/officeDocument/2006/relationships" xmlns:w="http://schemas.openxmlformats.org/wordprocessingml/2006/main" xmlns:w14="http://schemas.microsoft.com/office/word/2010/wordml" xmlns:w15="http://schemas.microsoft.com/office/word/2012/wordml" mc:Ignorable="w14 w15">
   <w:docDefaults>
-    <w:rPrDefault>
-      <w:rPr>
-        <w:rFonts w:ascii="Arial" w:cs="Arial" w:eastAsia="Arial" w:hAnsi="Arial"/>
-        <w:sz w:val="22"/>
-        <w:szCs w:val="22"/>
-      </w:rPr>
-    </w:rPrDefault>
+    <w:rPrDefault/>
     <w:pPrDefault/>
   </w:docDefaults>
   <w:style w:type="paragraph" w:styleId="Title">
@@ -1661,39 +1566,5 @@
       <w:szCs w:val="20"/>
     </w:rPr>
   </w:style>
-  <w:style w:type="paragraph" w:styleId="Heading1">
-    <w:name w:val="Heading 1"/>
-    <w:basedOn w:val="Normal"/>
-    <w:next w:val="Normal"/>
-    <w:qFormat/>
-    <w:pPr>
-      <w:spacing w:after="240" w:before="240"/>
-      <w:outlineLvl w:val="0"/>
-    </w:pPr>
-    <w:rPr>
-      <w:rFonts w:ascii="Arial" w:cs="Arial" w:eastAsia="Arial" w:hAnsi="Arial"/>
-      <w:b/>
-      <w:bCs/>
-      <w:sz w:val="36"/>
-      <w:szCs w:val="36"/>
-    </w:rPr>
-  </w:style>
-  <w:style w:type="paragraph" w:styleId="Heading2">
-    <w:name w:val="Heading 2"/>
-    <w:basedOn w:val="Normal"/>
-    <w:next w:val="Normal"/>
-    <w:qFormat/>
-    <w:pPr>
-      <w:spacing w:after="120" w:before="240"/>
-      <w:outlineLvl w:val="1"/>
-    </w:pPr>
-    <w:rPr>
-      <w:rFonts w:ascii="Arial" w:cs="Arial" w:eastAsia="Arial" w:hAnsi="Arial"/>
-      <w:b/>
-      <w:bCs/>
-      <w:sz w:val="26"/>
-      <w:szCs w:val="26"/>
-    </w:rPr>
-  </w:style>
 </w:styles>
 </file>
</xml_diff>